<commit_message>
docs: add cron frequencies and email alert details to architecture doc
</commit_message>
<xml_diff>
--- a/WaveForecast_Architecture.docx
+++ b/WaveForecast_Architecture.docx
@@ -112,13 +112,7 @@
         <w:rPr>
           <w:color w:val="555555"/>
         </w:rPr>
-        <w:t>Vibe Coding</w:t>
-      </w:r>
-      <w:r>
-        <w:rPr>
-          <w:color w:val="555555"/>
-        </w:rPr>
-        <w:t xml:space="preserve"> Course  | 2026</w:t>
+        <w:t>Vibe Coding Course  | 2026</w:t>
       </w:r>
     </w:p>
     <w:p>
@@ -522,21 +516,7 @@
                 <w:rStyle w:val="Hyperlink"/>
                 <w:noProof/>
               </w:rPr>
-              <w:t>Layered Architectu</w:t>
-            </w:r>
-            <w:r>
-              <w:rPr>
-                <w:rStyle w:val="Hyperlink"/>
-                <w:noProof/>
-              </w:rPr>
-              <w:t>r</w:t>
-            </w:r>
-            <w:r>
-              <w:rPr>
-                <w:rStyle w:val="Hyperlink"/>
-                <w:noProof/>
-              </w:rPr>
-              <w:t>e</w:t>
+              <w:t>Layered Architecture</w:t>
             </w:r>
             <w:r>
               <w:rPr>
@@ -1306,10 +1286,7 @@
       </w:r>
       <w:proofErr w:type="spellEnd"/>
       <w:r>
-        <w:t xml:space="preserve"> </w:t>
-      </w:r>
-      <w:r>
-        <w:t>is a free, open-source surf forecasting platform designed as a transparent alternative to commercial services such as Surfline. Surfers can browse real-time wave conditions across 60 global spots, save favorites, configure score-based email alerts, and converse with an AI assistant that fetches live data before answering.</w:t>
+        <w:t xml:space="preserve"> is a free, open-source surf forecasting platform designed as a transparent alternative to commercial services such as Surfline. Surfers can browse real-time wave conditions across 60+ global spots, save favorites, configure score-based email alerts, and converse with an AI assistant that fetches live data before answering.</w:t>
       </w:r>
     </w:p>
     <w:p>
@@ -1457,10 +1434,10 @@
           <w:noProof/>
         </w:rPr>
         <w:drawing>
-          <wp:inline distT="0" distB="0" distL="0" distR="0" wp14:anchorId="35DC025B" wp14:editId="54533121">
-            <wp:extent cx="5905500" cy="4191000"/>
+          <wp:inline distT="0" distB="0" distL="0" distR="0" wp14:anchorId="107D811B" wp14:editId="20C13D8E">
+            <wp:extent cx="5791200" cy="4343400"/>
             <wp:effectExtent l="0" t="0" r="0" b="0"/>
-            <wp:docPr id="1" name="ArchDiagram" descr="WaveForecast architecture overview" title="System Architecture Diagram"/>
+            <wp:docPr id="313631713" name="תמונה 1"/>
             <wp:cNvGraphicFramePr>
               <a:graphicFrameLocks xmlns:a="http://schemas.openxmlformats.org/drawingml/2006/main" noChangeAspect="1"/>
             </wp:cNvGraphicFramePr>
@@ -1468,22 +1445,25 @@
               <a:graphicData uri="http://schemas.openxmlformats.org/drawingml/2006/picture">
                 <pic:pic xmlns:pic="http://schemas.openxmlformats.org/drawingml/2006/picture">
                   <pic:nvPicPr>
-                    <pic:cNvPr id="0" name=""/>
-                    <pic:cNvPicPr>
-                      <a:picLocks noChangeAspect="1" noChangeArrowheads="1"/>
-                    </pic:cNvPicPr>
+                    <pic:cNvPr id="313631713" name="תמונה 313631713"/>
+                    <pic:cNvPicPr/>
                   </pic:nvPicPr>
                   <pic:blipFill>
-                    <a:blip r:embed="rId8"/>
-                    <a:srcRect/>
+                    <a:blip r:embed="rId8" cstate="print">
+                      <a:extLst>
+                        <a:ext uri="{28A0092B-C50C-407E-A947-70E740481C1C}">
+                          <a14:useLocalDpi xmlns:a14="http://schemas.microsoft.com/office/drawing/2010/main" val="0"/>
+                        </a:ext>
+                      </a:extLst>
+                    </a:blip>
                     <a:stretch>
                       <a:fillRect/>
                     </a:stretch>
                   </pic:blipFill>
-                  <pic:spPr bwMode="auto">
+                  <pic:spPr>
                     <a:xfrm>
                       <a:off x="0" y="0"/>
-                      <a:ext cx="5905500" cy="4191000"/>
+                      <a:ext cx="5814063" cy="4360547"/>
                     </a:xfrm>
                     <a:prstGeom prst="rect">
                       <a:avLst/>
@@ -1556,7 +1536,6 @@
         <w:pStyle w:val="2"/>
       </w:pPr>
       <w:r>
-        <w:lastRenderedPageBreak/>
         <w:t>System Layers</w:t>
       </w:r>
       <w:bookmarkEnd w:id="2"/>
@@ -1584,12 +1563,6 @@
         <w:gridCol w:w="4360"/>
       </w:tblGrid>
       <w:tr>
-        <w:tblPrEx>
-          <w:tblCellMar>
-            <w:top w:w="0" w:type="dxa"/>
-            <w:bottom w:w="0" w:type="dxa"/>
-          </w:tblCellMar>
-        </w:tblPrEx>
         <w:trPr>
           <w:tblHeader/>
         </w:trPr>
@@ -1694,12 +1667,6 @@
         </w:tc>
       </w:tr>
       <w:tr>
-        <w:tblPrEx>
-          <w:tblCellMar>
-            <w:top w:w="0" w:type="dxa"/>
-            <w:bottom w:w="0" w:type="dxa"/>
-          </w:tblCellMar>
-        </w:tblPrEx>
         <w:tc>
           <w:tcPr>
             <w:tcW w:w="2000" w:type="dxa"/>
@@ -1792,12 +1759,6 @@
         </w:tc>
       </w:tr>
       <w:tr>
-        <w:tblPrEx>
-          <w:tblCellMar>
-            <w:top w:w="0" w:type="dxa"/>
-            <w:bottom w:w="0" w:type="dxa"/>
-          </w:tblCellMar>
-        </w:tblPrEx>
         <w:tc>
           <w:tcPr>
             <w:tcW w:w="2000" w:type="dxa"/>
@@ -1890,12 +1851,6 @@
         </w:tc>
       </w:tr>
       <w:tr>
-        <w:tblPrEx>
-          <w:tblCellMar>
-            <w:top w:w="0" w:type="dxa"/>
-            <w:bottom w:w="0" w:type="dxa"/>
-          </w:tblCellMar>
-        </w:tblPrEx>
         <w:tc>
           <w:tcPr>
             <w:tcW w:w="2000" w:type="dxa"/>
@@ -1988,12 +1943,6 @@
         </w:tc>
       </w:tr>
       <w:tr>
-        <w:tblPrEx>
-          <w:tblCellMar>
-            <w:top w:w="0" w:type="dxa"/>
-            <w:bottom w:w="0" w:type="dxa"/>
-          </w:tblCellMar>
-        </w:tblPrEx>
         <w:tc>
           <w:tcPr>
             <w:tcW w:w="2000" w:type="dxa"/>
@@ -2086,12 +2035,6 @@
         </w:tc>
       </w:tr>
       <w:tr>
-        <w:tblPrEx>
-          <w:tblCellMar>
-            <w:top w:w="0" w:type="dxa"/>
-            <w:bottom w:w="0" w:type="dxa"/>
-          </w:tblCellMar>
-        </w:tblPrEx>
         <w:tc>
           <w:tcPr>
             <w:tcW w:w="2000" w:type="dxa"/>
@@ -2202,12 +2145,6 @@
         </w:tc>
       </w:tr>
       <w:tr>
-        <w:tblPrEx>
-          <w:tblCellMar>
-            <w:top w:w="0" w:type="dxa"/>
-            <w:bottom w:w="0" w:type="dxa"/>
-          </w:tblCellMar>
-        </w:tblPrEx>
         <w:tc>
           <w:tcPr>
             <w:tcW w:w="2000" w:type="dxa"/>
@@ -2409,12 +2346,6 @@
         <w:gridCol w:w="6960"/>
       </w:tblGrid>
       <w:tr>
-        <w:tblPrEx>
-          <w:tblCellMar>
-            <w:top w:w="0" w:type="dxa"/>
-            <w:bottom w:w="0" w:type="dxa"/>
-          </w:tblCellMar>
-        </w:tblPrEx>
         <w:trPr>
           <w:tblHeader/>
         </w:trPr>
@@ -2486,12 +2417,6 @@
         </w:tc>
       </w:tr>
       <w:tr>
-        <w:tblPrEx>
-          <w:tblCellMar>
-            <w:top w:w="0" w:type="dxa"/>
-            <w:bottom w:w="0" w:type="dxa"/>
-          </w:tblCellMar>
-        </w:tblPrEx>
         <w:tc>
           <w:tcPr>
             <w:tcW w:w="2400" w:type="dxa"/>
@@ -2554,12 +2479,6 @@
         </w:tc>
       </w:tr>
       <w:tr>
-        <w:tblPrEx>
-          <w:tblCellMar>
-            <w:top w:w="0" w:type="dxa"/>
-            <w:bottom w:w="0" w:type="dxa"/>
-          </w:tblCellMar>
-        </w:tblPrEx>
         <w:tc>
           <w:tcPr>
             <w:tcW w:w="2400" w:type="dxa"/>
@@ -2636,12 +2555,6 @@
         </w:tc>
       </w:tr>
       <w:tr>
-        <w:tblPrEx>
-          <w:tblCellMar>
-            <w:top w:w="0" w:type="dxa"/>
-            <w:bottom w:w="0" w:type="dxa"/>
-          </w:tblCellMar>
-        </w:tblPrEx>
         <w:tc>
           <w:tcPr>
             <w:tcW w:w="2400" w:type="dxa"/>
@@ -2718,12 +2631,6 @@
         </w:tc>
       </w:tr>
       <w:tr>
-        <w:tblPrEx>
-          <w:tblCellMar>
-            <w:top w:w="0" w:type="dxa"/>
-            <w:bottom w:w="0" w:type="dxa"/>
-          </w:tblCellMar>
-        </w:tblPrEx>
         <w:tc>
           <w:tcPr>
             <w:tcW w:w="2400" w:type="dxa"/>
@@ -2849,6 +2756,14 @@
       <w:proofErr w:type="spellEnd"/>
       <w:r>
         <w:t xml:space="preserve"> job periodically purges expired cache rows.</w:t>
+      </w:r>
+    </w:p>
+    <w:p>
+      <w:pPr>
+        <w:bidi w:val="0"/>
+      </w:pPr>
+      <w:r>
+        <w:t xml:space="preserve">Two node-cron background jobs run on the server: (1) Alert Checker — runs every 30 minutes between 05:00–20:00, checks all active alerts, and sends an email via Brevo API when a spot's score meets the user's threshold. Each alert is sent at most once per day. (2) Cache Cleanup — runs every 6 hours and purges expired forecast rows (TTL: 3 hours).</w:t>
       </w:r>
     </w:p>
     <w:p>
@@ -2880,12 +2795,6 @@
         <w:gridCol w:w="2560"/>
       </w:tblGrid>
       <w:tr>
-        <w:tblPrEx>
-          <w:tblCellMar>
-            <w:top w:w="0" w:type="dxa"/>
-            <w:bottom w:w="0" w:type="dxa"/>
-          </w:tblCellMar>
-        </w:tblPrEx>
         <w:trPr>
           <w:tblHeader/>
         </w:trPr>
@@ -2990,12 +2899,6 @@
         </w:tc>
       </w:tr>
       <w:tr>
-        <w:tblPrEx>
-          <w:tblCellMar>
-            <w:top w:w="0" w:type="dxa"/>
-            <w:bottom w:w="0" w:type="dxa"/>
-          </w:tblCellMar>
-        </w:tblPrEx>
         <w:tc>
           <w:tcPr>
             <w:tcW w:w="2800" w:type="dxa"/>
@@ -3118,12 +3021,6 @@
         </w:tc>
       </w:tr>
       <w:tr>
-        <w:tblPrEx>
-          <w:tblCellMar>
-            <w:top w:w="0" w:type="dxa"/>
-            <w:bottom w:w="0" w:type="dxa"/>
-          </w:tblCellMar>
-        </w:tblPrEx>
         <w:tc>
           <w:tcPr>
             <w:tcW w:w="2800" w:type="dxa"/>
@@ -3151,6 +3048,7 @@
                 <w:sz w:val="20"/>
                 <w:szCs w:val="20"/>
               </w:rPr>
+              <w:lastRenderedPageBreak/>
               <w:t>OpenWeatherMap</w:t>
             </w:r>
             <w:proofErr w:type="spellEnd"/>
@@ -3241,7 +3139,6 @@
       </w:pPr>
       <w:bookmarkStart w:id="6" w:name="_Toc230188882"/>
       <w:r>
-        <w:lastRenderedPageBreak/>
         <w:t>4. Authentication &amp; Security</w:t>
       </w:r>
       <w:bookmarkEnd w:id="6"/>
@@ -3372,12 +3269,6 @@
         <w:gridCol w:w="6560"/>
       </w:tblGrid>
       <w:tr>
-        <w:tblPrEx>
-          <w:tblCellMar>
-            <w:top w:w="0" w:type="dxa"/>
-            <w:bottom w:w="0" w:type="dxa"/>
-          </w:tblCellMar>
-        </w:tblPrEx>
         <w:trPr>
           <w:tblHeader/>
         </w:trPr>
@@ -3449,12 +3340,6 @@
         </w:tc>
       </w:tr>
       <w:tr>
-        <w:tblPrEx>
-          <w:tblCellMar>
-            <w:top w:w="0" w:type="dxa"/>
-            <w:bottom w:w="0" w:type="dxa"/>
-          </w:tblCellMar>
-        </w:tblPrEx>
         <w:tc>
           <w:tcPr>
             <w:tcW w:w="2800" w:type="dxa"/>
@@ -3533,12 +3418,6 @@
         </w:tc>
       </w:tr>
       <w:tr>
-        <w:tblPrEx>
-          <w:tblCellMar>
-            <w:top w:w="0" w:type="dxa"/>
-            <w:bottom w:w="0" w:type="dxa"/>
-          </w:tblCellMar>
-        </w:tblPrEx>
         <w:tc>
           <w:tcPr>
             <w:tcW w:w="2800" w:type="dxa"/>
@@ -3615,12 +3494,6 @@
         </w:tc>
       </w:tr>
       <w:tr>
-        <w:tblPrEx>
-          <w:tblCellMar>
-            <w:top w:w="0" w:type="dxa"/>
-            <w:bottom w:w="0" w:type="dxa"/>
-          </w:tblCellMar>
-        </w:tblPrEx>
         <w:tc>
           <w:tcPr>
             <w:tcW w:w="2800" w:type="dxa"/>
@@ -3692,12 +3565,6 @@
         </w:tc>
       </w:tr>
       <w:tr>
-        <w:tblPrEx>
-          <w:tblCellMar>
-            <w:top w:w="0" w:type="dxa"/>
-            <w:bottom w:w="0" w:type="dxa"/>
-          </w:tblCellMar>
-        </w:tblPrEx>
         <w:tc>
           <w:tcPr>
             <w:tcW w:w="2800" w:type="dxa"/>
@@ -3824,12 +3691,6 @@
         <w:gridCol w:w="5760"/>
       </w:tblGrid>
       <w:tr>
-        <w:tblPrEx>
-          <w:tblCellMar>
-            <w:top w:w="0" w:type="dxa"/>
-            <w:bottom w:w="0" w:type="dxa"/>
-          </w:tblCellMar>
-        </w:tblPrEx>
         <w:trPr>
           <w:tblHeader/>
         </w:trPr>
@@ -3934,12 +3795,6 @@
         </w:tc>
       </w:tr>
       <w:tr>
-        <w:tblPrEx>
-          <w:tblCellMar>
-            <w:top w:w="0" w:type="dxa"/>
-            <w:bottom w:w="0" w:type="dxa"/>
-          </w:tblCellMar>
-        </w:tblPrEx>
         <w:tc>
           <w:tcPr>
             <w:tcW w:w="2400" w:type="dxa"/>
@@ -4032,12 +3887,6 @@
         </w:tc>
       </w:tr>
       <w:tr>
-        <w:tblPrEx>
-          <w:tblCellMar>
-            <w:top w:w="0" w:type="dxa"/>
-            <w:bottom w:w="0" w:type="dxa"/>
-          </w:tblCellMar>
-        </w:tblPrEx>
         <w:tc>
           <w:tcPr>
             <w:tcW w:w="2400" w:type="dxa"/>
@@ -4146,12 +3995,6 @@
         </w:tc>
       </w:tr>
       <w:tr>
-        <w:tblPrEx>
-          <w:tblCellMar>
-            <w:top w:w="0" w:type="dxa"/>
-            <w:bottom w:w="0" w:type="dxa"/>
-          </w:tblCellMar>
-        </w:tblPrEx>
         <w:tc>
           <w:tcPr>
             <w:tcW w:w="2400" w:type="dxa"/>
@@ -4244,12 +4087,6 @@
         </w:tc>
       </w:tr>
       <w:tr>
-        <w:tblPrEx>
-          <w:tblCellMar>
-            <w:top w:w="0" w:type="dxa"/>
-            <w:bottom w:w="0" w:type="dxa"/>
-          </w:tblCellMar>
-        </w:tblPrEx>
         <w:tc>
           <w:tcPr>
             <w:tcW w:w="2400" w:type="dxa"/>
@@ -4342,12 +4179,6 @@
         </w:tc>
       </w:tr>
       <w:tr>
-        <w:tblPrEx>
-          <w:tblCellMar>
-            <w:top w:w="0" w:type="dxa"/>
-            <w:bottom w:w="0" w:type="dxa"/>
-          </w:tblCellMar>
-        </w:tblPrEx>
         <w:tc>
           <w:tcPr>
             <w:tcW w:w="2400" w:type="dxa"/>
@@ -4469,12 +4300,6 @@
         <w:gridCol w:w="6360"/>
       </w:tblGrid>
       <w:tr>
-        <w:tblPrEx>
-          <w:tblCellMar>
-            <w:top w:w="0" w:type="dxa"/>
-            <w:bottom w:w="0" w:type="dxa"/>
-          </w:tblCellMar>
-        </w:tblPrEx>
         <w:trPr>
           <w:tblHeader/>
         </w:trPr>
@@ -4579,12 +4404,6 @@
         </w:tc>
       </w:tr>
       <w:tr>
-        <w:tblPrEx>
-          <w:tblCellMar>
-            <w:top w:w="0" w:type="dxa"/>
-            <w:bottom w:w="0" w:type="dxa"/>
-          </w:tblCellMar>
-        </w:tblPrEx>
         <w:tc>
           <w:tcPr>
             <w:tcW w:w="1600" w:type="dxa"/>
@@ -4677,12 +4496,6 @@
         </w:tc>
       </w:tr>
       <w:tr>
-        <w:tblPrEx>
-          <w:tblCellMar>
-            <w:top w:w="0" w:type="dxa"/>
-            <w:bottom w:w="0" w:type="dxa"/>
-          </w:tblCellMar>
-        </w:tblPrEx>
         <w:tc>
           <w:tcPr>
             <w:tcW w:w="1600" w:type="dxa"/>
@@ -4775,12 +4588,6 @@
         </w:tc>
       </w:tr>
       <w:tr>
-        <w:tblPrEx>
-          <w:tblCellMar>
-            <w:top w:w="0" w:type="dxa"/>
-            <w:bottom w:w="0" w:type="dxa"/>
-          </w:tblCellMar>
-        </w:tblPrEx>
         <w:tc>
           <w:tcPr>
             <w:tcW w:w="1600" w:type="dxa"/>
@@ -4873,12 +4680,6 @@
         </w:tc>
       </w:tr>
       <w:tr>
-        <w:tblPrEx>
-          <w:tblCellMar>
-            <w:top w:w="0" w:type="dxa"/>
-            <w:bottom w:w="0" w:type="dxa"/>
-          </w:tblCellMar>
-        </w:tblPrEx>
         <w:tc>
           <w:tcPr>
             <w:tcW w:w="1600" w:type="dxa"/>
@@ -4971,12 +4772,6 @@
         </w:tc>
       </w:tr>
       <w:tr>
-        <w:tblPrEx>
-          <w:tblCellMar>
-            <w:top w:w="0" w:type="dxa"/>
-            <w:bottom w:w="0" w:type="dxa"/>
-          </w:tblCellMar>
-        </w:tblPrEx>
         <w:tc>
           <w:tcPr>
             <w:tcW w:w="1600" w:type="dxa"/>
@@ -5105,7 +4900,6 @@
       </w:pPr>
       <w:bookmarkStart w:id="8" w:name="_Toc230188884"/>
       <w:r>
-        <w:lastRenderedPageBreak/>
         <w:t>6. AI Surf Assistant</w:t>
       </w:r>
       <w:bookmarkEnd w:id="8"/>
@@ -5501,17 +5295,6 @@
       <w:r>
         <w:t>Key design decisions: (1) The instruction to always use tools before answering prevents hallucination of forecast data. (2) Mirroring the user's language requires zero routing logic in the application. (3) The explicit JSON format rule reduces malformed tool calls that would break the loop.</w:t>
       </w:r>
-    </w:p>
-    <w:p>
-      <w:pPr>
-        <w:bidi w:val="0"/>
-        <w:spacing w:before="100"/>
-      </w:pPr>
-    </w:p>
-    <w:p>
-      <w:pPr>
-        <w:pStyle w:val="2"/>
-      </w:pPr>
       <w:bookmarkStart w:id="10" w:name="_Toc230188886"/>
     </w:p>
     <w:p>
@@ -5546,12 +5329,6 @@
         <w:gridCol w:w="4299"/>
       </w:tblGrid>
       <w:tr>
-        <w:tblPrEx>
-          <w:tblCellMar>
-            <w:top w:w="0" w:type="dxa"/>
-            <w:bottom w:w="0" w:type="dxa"/>
-          </w:tblCellMar>
-        </w:tblPrEx>
         <w:trPr>
           <w:tblHeader/>
         </w:trPr>
@@ -5656,12 +5433,6 @@
         </w:tc>
       </w:tr>
       <w:tr>
-        <w:tblPrEx>
-          <w:tblCellMar>
-            <w:top w:w="0" w:type="dxa"/>
-            <w:bottom w:w="0" w:type="dxa"/>
-          </w:tblCellMar>
-        </w:tblPrEx>
         <w:tc>
           <w:tcPr>
             <w:tcW w:w="2400" w:type="dxa"/>
@@ -5757,18 +5528,12 @@
                 <w:sz w:val="20"/>
                 <w:szCs w:val="20"/>
               </w:rPr>
-              <w:t>All 25 known spots (id, name, country, region)</w:t>
+              <w:t>All known spots (id, name, country, region)</w:t>
             </w:r>
           </w:p>
         </w:tc>
       </w:tr>
       <w:tr>
-        <w:tblPrEx>
-          <w:tblCellMar>
-            <w:top w:w="0" w:type="dxa"/>
-            <w:bottom w:w="0" w:type="dxa"/>
-          </w:tblCellMar>
-        </w:tblPrEx>
         <w:tc>
           <w:tcPr>
             <w:tcW w:w="2400" w:type="dxa"/>
@@ -5895,12 +5660,6 @@
         </w:tc>
       </w:tr>
       <w:tr>
-        <w:tblPrEx>
-          <w:tblCellMar>
-            <w:top w:w="0" w:type="dxa"/>
-            <w:bottom w:w="0" w:type="dxa"/>
-          </w:tblCellMar>
-        </w:tblPrEx>
         <w:tc>
           <w:tcPr>
             <w:tcW w:w="2400" w:type="dxa"/>
@@ -6049,7 +5808,6 @@
         <w:pStyle w:val="2"/>
       </w:pPr>
       <w:r>
-        <w:lastRenderedPageBreak/>
         <w:t>Agentic Loop</w:t>
       </w:r>
       <w:bookmarkEnd w:id="11"/>
@@ -6217,12 +5975,6 @@
         <w:gridCol w:w="5560"/>
       </w:tblGrid>
       <w:tr>
-        <w:tblPrEx>
-          <w:tblCellMar>
-            <w:top w:w="0" w:type="dxa"/>
-            <w:bottom w:w="0" w:type="dxa"/>
-          </w:tblCellMar>
-        </w:tblPrEx>
         <w:trPr>
           <w:tblHeader/>
         </w:trPr>
@@ -6327,12 +6079,6 @@
         </w:tc>
       </w:tr>
       <w:tr>
-        <w:tblPrEx>
-          <w:tblCellMar>
-            <w:top w:w="0" w:type="dxa"/>
-            <w:bottom w:w="0" w:type="dxa"/>
-          </w:tblCellMar>
-        </w:tblPrEx>
         <w:tc>
           <w:tcPr>
             <w:tcW w:w="1800" w:type="dxa"/>
@@ -6425,12 +6171,6 @@
         </w:tc>
       </w:tr>
       <w:tr>
-        <w:tblPrEx>
-          <w:tblCellMar>
-            <w:top w:w="0" w:type="dxa"/>
-            <w:bottom w:w="0" w:type="dxa"/>
-          </w:tblCellMar>
-        </w:tblPrEx>
         <w:tc>
           <w:tcPr>
             <w:tcW w:w="1800" w:type="dxa"/>
@@ -6553,12 +6293,6 @@
         </w:tc>
       </w:tr>
       <w:tr>
-        <w:tblPrEx>
-          <w:tblCellMar>
-            <w:top w:w="0" w:type="dxa"/>
-            <w:bottom w:w="0" w:type="dxa"/>
-          </w:tblCellMar>
-        </w:tblPrEx>
         <w:tc>
           <w:tcPr>
             <w:tcW w:w="1800" w:type="dxa"/>
@@ -6728,10 +6462,7 @@
       </w:r>
       <w:proofErr w:type="spellEnd"/>
       <w:r>
-        <w:t xml:space="preserve"> </w:t>
-      </w:r>
-      <w:r>
-        <w:t>integrates a wide range of distinct engineering concerns into a single cohesive production application:</w:t>
+        <w:t xml:space="preserve"> integrates a wide range of distinct engineering concerns into a single cohesive production application:</w:t>
       </w:r>
     </w:p>
     <w:p>
@@ -6762,12 +6493,6 @@
         <w:gridCol w:w="6360"/>
       </w:tblGrid>
       <w:tr>
-        <w:tblPrEx>
-          <w:tblCellMar>
-            <w:top w:w="0" w:type="dxa"/>
-            <w:bottom w:w="0" w:type="dxa"/>
-          </w:tblCellMar>
-        </w:tblPrEx>
         <w:trPr>
           <w:tblHeader/>
         </w:trPr>
@@ -6839,12 +6564,6 @@
         </w:tc>
       </w:tr>
       <w:tr>
-        <w:tblPrEx>
-          <w:tblCellMar>
-            <w:top w:w="0" w:type="dxa"/>
-            <w:bottom w:w="0" w:type="dxa"/>
-          </w:tblCellMar>
-        </w:tblPrEx>
         <w:tc>
           <w:tcPr>
             <w:tcW w:w="3000" w:type="dxa"/>
@@ -6907,12 +6626,6 @@
         </w:tc>
       </w:tr>
       <w:tr>
-        <w:tblPrEx>
-          <w:tblCellMar>
-            <w:top w:w="0" w:type="dxa"/>
-            <w:bottom w:w="0" w:type="dxa"/>
-          </w:tblCellMar>
-        </w:tblPrEx>
         <w:tc>
           <w:tcPr>
             <w:tcW w:w="3000" w:type="dxa"/>
@@ -7000,12 +6713,6 @@
         </w:tc>
       </w:tr>
       <w:tr>
-        <w:tblPrEx>
-          <w:tblCellMar>
-            <w:top w:w="0" w:type="dxa"/>
-            <w:bottom w:w="0" w:type="dxa"/>
-          </w:tblCellMar>
-        </w:tblPrEx>
         <w:tc>
           <w:tcPr>
             <w:tcW w:w="3000" w:type="dxa"/>
@@ -7068,12 +6775,6 @@
         </w:tc>
       </w:tr>
       <w:tr>
-        <w:tblPrEx>
-          <w:tblCellMar>
-            <w:top w:w="0" w:type="dxa"/>
-            <w:bottom w:w="0" w:type="dxa"/>
-          </w:tblCellMar>
-        </w:tblPrEx>
         <w:tc>
           <w:tcPr>
             <w:tcW w:w="3000" w:type="dxa"/>
@@ -7152,12 +6853,6 @@
         </w:tc>
       </w:tr>
       <w:tr>
-        <w:tblPrEx>
-          <w:tblCellMar>
-            <w:top w:w="0" w:type="dxa"/>
-            <w:bottom w:w="0" w:type="dxa"/>
-          </w:tblCellMar>
-        </w:tblPrEx>
         <w:tc>
           <w:tcPr>
             <w:tcW w:w="3000" w:type="dxa"/>
@@ -7220,12 +6915,6 @@
         </w:tc>
       </w:tr>
       <w:tr>
-        <w:tblPrEx>
-          <w:tblCellMar>
-            <w:top w:w="0" w:type="dxa"/>
-            <w:bottom w:w="0" w:type="dxa"/>
-          </w:tblCellMar>
-        </w:tblPrEx>
         <w:tc>
           <w:tcPr>
             <w:tcW w:w="3000" w:type="dxa"/>
@@ -7252,6 +6941,7 @@
                 <w:sz w:val="20"/>
                 <w:szCs w:val="20"/>
               </w:rPr>
+              <w:lastRenderedPageBreak/>
               <w:t>Agentic AI</w:t>
             </w:r>
           </w:p>
@@ -7288,12 +6978,6 @@
         </w:tc>
       </w:tr>
       <w:tr>
-        <w:tblPrEx>
-          <w:tblCellMar>
-            <w:top w:w="0" w:type="dxa"/>
-            <w:bottom w:w="0" w:type="dxa"/>
-          </w:tblCellMar>
-        </w:tblPrEx>
         <w:tc>
           <w:tcPr>
             <w:tcW w:w="3000" w:type="dxa"/>
@@ -7320,7 +7004,6 @@
                 <w:sz w:val="20"/>
                 <w:szCs w:val="20"/>
               </w:rPr>
-              <w:lastRenderedPageBreak/>
               <w:t>Background jobs</w:t>
             </w:r>
           </w:p>
@@ -7373,12 +7056,6 @@
         </w:tc>
       </w:tr>
       <w:tr>
-        <w:tblPrEx>
-          <w:tblCellMar>
-            <w:top w:w="0" w:type="dxa"/>
-            <w:bottom w:w="0" w:type="dxa"/>
-          </w:tblCellMar>
-        </w:tblPrEx>
         <w:tc>
           <w:tcPr>
             <w:tcW w:w="3000" w:type="dxa"/>
@@ -7476,47 +7153,7 @@
           <w:sz w:val="21"/>
           <w:szCs w:val="21"/>
         </w:rPr>
-        <w:t>The email alert system is architecturally complete (</w:t>
-      </w:r>
-      <w:proofErr w:type="spellStart"/>
-      <w:r>
-        <w:rPr>
-          <w:i/>
-          <w:iCs/>
-          <w:sz w:val="21"/>
-          <w:szCs w:val="21"/>
-        </w:rPr>
-        <w:t>cron</w:t>
-      </w:r>
-      <w:proofErr w:type="spellEnd"/>
-      <w:r>
-        <w:rPr>
-          <w:i/>
-          <w:iCs/>
-          <w:sz w:val="21"/>
-          <w:szCs w:val="21"/>
-        </w:rPr>
-        <w:t xml:space="preserve"> job, DB tracking, </w:t>
-      </w:r>
-      <w:proofErr w:type="spellStart"/>
-      <w:r>
-        <w:rPr>
-          <w:i/>
-          <w:iCs/>
-          <w:sz w:val="21"/>
-          <w:szCs w:val="21"/>
-        </w:rPr>
-        <w:t>Brevo API</w:t>
-      </w:r>
-      <w:proofErr w:type="spellEnd"/>
-      <w:r>
-        <w:rPr>
-          <w:i/>
-          <w:iCs/>
-          <w:sz w:val="21"/>
-          <w:szCs w:val="21"/>
-        </w:rPr>
-        <w:t xml:space="preserve"> transport) and active in production, sending alerts via the Brevo HTTP API.</w:t>
+        <w:t>The email alert system is fully active in production: a cron job (every 30 minutes, 05:00–20:00) checks all user-configured score thresholds and sends transactional emails via the Brevo HTTP API. Each alert is rate-limited to one email per day per spot.</w:t>
       </w:r>
     </w:p>
     <w:sectPr>

</xml_diff>

<commit_message>
docs: add Alert Rate Limiting explanation to architecture doc
</commit_message>
<xml_diff>
--- a/WaveForecast_Architecture.docx
+++ b/WaveForecast_Architecture.docx
@@ -2764,6 +2764,25 @@
       </w:pPr>
       <w:r>
         <w:t xml:space="preserve">Two node-cron background jobs run on the server: (1) Alert Checker — runs every 30 minutes between 05:00–20:00, checks all active alerts, and sends an email via Brevo API when a spot's score meets the user's threshold. Each alert is sent at most once per day. (2) Cache Cleanup — runs every 6 hours and purges expired forecast rows (TTL: 3 hours).</w:t>
+      </w:r>
+    </w:p>
+    <w:p>
+      <w:pPr>
+        <w:bidi w:val="0"/>
+      </w:pPr>
+      <w:r>
+        <w:rPr>
+          <w:b/>
+        </w:rPr>
+        <w:t xml:space="preserve">Alert Rate Limiting</w:t>
+      </w:r>
+    </w:p>
+    <w:p>
+      <w:pPr>
+        <w:bidi w:val="0"/>
+      </w:pPr>
+      <w:r>
+        <w:t xml:space="preserve">Each alert is intentionally capped at one email per day per spot. Without this limit, a user whose threshold is met throughout the day would receive an alert every 30 minutes — which would be perceived as spam and lead to unsubscribes. The single daily email conveys the key message (“conditions are good — go surf”) without repeated noise. The lastSentAt timestamp in the alerts table is used to enforce this: the checker skips any alert where lastSentAt is today's date.</w:t>
       </w:r>
     </w:p>
     <w:p>

</xml_diff>

<commit_message>
docs: remove redundant cron sentence and add Brevo to deployment table
</commit_message>
<xml_diff>
--- a/WaveForecast_Architecture.docx
+++ b/WaveForecast_Architecture.docx
@@ -1434,7 +1434,7 @@
           <w:noProof/>
         </w:rPr>
         <w:drawing>
-          <wp:inline distT="0" distB="0" distL="0" distR="0" wp14:anchorId="107D811B" wp14:editId="20C13D8E">
+          <wp:inline distT="0" distB="0" distL="0" distR="0" wp14:anchorId="14DBDCED" wp14:editId="44FCA383">
             <wp:extent cx="5791200" cy="4343400"/>
             <wp:effectExtent l="0" t="0" r="0" b="0"/>
             <wp:docPr id="313631713" name="תמונה 1"/>
@@ -2749,40 +2749,82 @@
       <w:r>
         <w:t xml:space="preserve"> interface. The result is scored, cached, and returned. A node-</w:t>
       </w:r>
-      <w:proofErr w:type="spellStart"/>
-      <w:r>
-        <w:t>cron</w:t>
-      </w:r>
-      <w:proofErr w:type="spellEnd"/>
-      <w:r>
-        <w:t xml:space="preserve"> job periodically purges expired cache rows.</w:t>
-      </w:r>
-    </w:p>
-    <w:p>
-      <w:pPr>
-        <w:bidi w:val="0"/>
-      </w:pPr>
-      <w:r>
-        <w:t xml:space="preserve">Two node-cron background jobs run on the server: (1) Alert Checker — runs every 30 minutes between 05:00–20:00, checks all active alerts, and sends an email via Brevo API when a spot's score meets the user's threshold. Each alert is sent at most once per day. (2) Cache Cleanup — runs every 6 hours and purges expired forecast rows (TTL: 3 hours).</w:t>
-      </w:r>
-    </w:p>
-    <w:p>
-      <w:pPr>
-        <w:bidi w:val="0"/>
+    </w:p>
+    <w:p>
+      <w:pPr>
+        <w:bidi w:val="0"/>
+      </w:pPr>
+      <w:r>
+        <w:t xml:space="preserve">Two node-cron background jobs run on the server: (1) Alert Checker </w:t>
+      </w:r>
+      <w:r>
+        <w:t>-</w:t>
+      </w:r>
+      <w:r>
+        <w:t xml:space="preserve">runs every 30 minutes between 05:00–20:00, checks all active alerts, and sends an email via Brevo API when a spot's score meets the user's threshold. Each alert is sent at most once per day. (2) Cache Cleanup </w:t>
+      </w:r>
+      <w:r>
+        <w:t>-</w:t>
+      </w:r>
+      <w:r>
+        <w:t>runs every 6 hours and purges expired forecast rows (TTL: 3 hours).</w:t>
+      </w:r>
+    </w:p>
+    <w:p>
+      <w:pPr>
+        <w:bidi w:val="0"/>
+        <w:rPr>
+          <w:b/>
+          <w:rtl/>
+        </w:rPr>
+      </w:pPr>
+    </w:p>
+    <w:p>
+      <w:pPr>
+        <w:bidi w:val="0"/>
+        <w:rPr>
+          <w:b/>
+          <w:rtl/>
+        </w:rPr>
+      </w:pPr>
+    </w:p>
+    <w:p>
+      <w:pPr>
+        <w:bidi w:val="0"/>
+        <w:rPr>
+          <w:rFonts w:hint="cs"/>
+          <w:rtl/>
+        </w:rPr>
       </w:pPr>
       <w:r>
         <w:rPr>
           <w:b/>
         </w:rPr>
-        <w:t xml:space="preserve">Alert Rate Limiting</w:t>
-      </w:r>
-    </w:p>
-    <w:p>
-      <w:pPr>
-        <w:bidi w:val="0"/>
-      </w:pPr>
-      <w:r>
-        <w:t xml:space="preserve">Each alert is intentionally capped at one email per day per spot. Without this limit, a user whose threshold is met throughout the day would receive an alert every 30 minutes — which would be perceived as spam and lead to unsubscribes. The single daily email conveys the key message (“conditions are good — go surf”) without repeated noise. The lastSentAt timestamp in the alerts table is used to enforce this: the checker skips any alert where lastSentAt is today's date.</w:t>
+        <w:lastRenderedPageBreak/>
+        <w:t>Alert Rate Limiting</w:t>
+      </w:r>
+      <w:r>
+        <w:t>:</w:t>
+      </w:r>
+    </w:p>
+    <w:p>
+      <w:pPr>
+        <w:bidi w:val="0"/>
+      </w:pPr>
+      <w:r>
+        <w:t xml:space="preserve">Each alert is intentionally capped at one email per day per spot. Without this limit, a user whose threshold is met throughout the day would receive an alert every 30 minutes </w:t>
+      </w:r>
+      <w:r>
+        <w:t>-</w:t>
+      </w:r>
+      <w:r>
+        <w:t xml:space="preserve">which would be perceived as spam and lead to unsubscribes. The single daily email conveys the key message (“conditions are good </w:t>
+      </w:r>
+      <w:r>
+        <w:t>-</w:t>
+      </w:r>
+      <w:r>
+        <w:t>go surf”) without repeated noise. The lastSentAt timestamp in the alerts table is used to enforce this: the checker skips any alert where lastSentAt is today's date.</w:t>
       </w:r>
     </w:p>
     <w:p>
@@ -3067,7 +3109,6 @@
                 <w:sz w:val="20"/>
                 <w:szCs w:val="20"/>
               </w:rPr>
-              <w:lastRenderedPageBreak/>
               <w:t>OpenWeatherMap</w:t>
             </w:r>
             <w:proofErr w:type="spellEnd"/>
@@ -5319,8 +5360,17 @@
     <w:p>
       <w:pPr>
         <w:pStyle w:val="2"/>
-      </w:pPr>
-      <w:r>
+        <w:rPr>
+          <w:rtl/>
+        </w:rPr>
+      </w:pPr>
+    </w:p>
+    <w:p>
+      <w:pPr>
+        <w:pStyle w:val="2"/>
+      </w:pPr>
+      <w:r>
+        <w:lastRenderedPageBreak/>
         <w:t>Available Tools</w:t>
       </w:r>
       <w:bookmarkEnd w:id="10"/>
@@ -5816,16 +5866,6 @@
         <w:pStyle w:val="2"/>
       </w:pPr>
       <w:bookmarkStart w:id="11" w:name="_Toc230188887"/>
-    </w:p>
-    <w:p>
-      <w:pPr>
-        <w:pStyle w:val="2"/>
-      </w:pPr>
-    </w:p>
-    <w:p>
-      <w:pPr>
-        <w:pStyle w:val="2"/>
-      </w:pPr>
       <w:r>
         <w:t>Agentic Loop</w:t>
       </w:r>
@@ -6405,6 +6445,53 @@
           </w:p>
         </w:tc>
       </w:tr>
+      <w:tr>
+        <w:tc>
+          <w:tcPr>
+            <w:tcBorders>
+              <w:top w:val="single" w:sz="4" w:space="0" w:color="auto"/>
+              <w:left w:val="single" w:sz="4" w:space="0" w:color="auto"/>
+              <w:bottom w:val="single" w:sz="4" w:space="0" w:color="auto"/>
+              <w:right w:val="single" w:sz="4" w:space="0" w:color="auto"/>
+            </w:tcBorders>
+          </w:tcPr>
+          <w:p>
+            <w:r>
+              <w:t>Brevo</w:t>
+            </w:r>
+          </w:p>
+        </w:tc>
+        <w:tc>
+          <w:tcPr>
+            <w:tcBorders>
+              <w:top w:val="single" w:sz="4" w:space="0" w:color="auto"/>
+              <w:left w:val="single" w:sz="4" w:space="0" w:color="auto"/>
+              <w:bottom w:val="single" w:sz="4" w:space="0" w:color="auto"/>
+              <w:right w:val="single" w:sz="4" w:space="0" w:color="auto"/>
+            </w:tcBorders>
+          </w:tcPr>
+          <w:p>
+            <w:r>
+              <w:t>Email alerts</w:t>
+            </w:r>
+          </w:p>
+        </w:tc>
+        <w:tc>
+          <w:tcPr>
+            <w:tcBorders>
+              <w:top w:val="single" w:sz="4" w:space="0" w:color="auto"/>
+              <w:left w:val="single" w:sz="4" w:space="0" w:color="auto"/>
+              <w:bottom w:val="single" w:sz="4" w:space="0" w:color="auto"/>
+              <w:right w:val="single" w:sz="4" w:space="0" w:color="auto"/>
+            </w:tcBorders>
+          </w:tcPr>
+          <w:p>
+            <w:r>
+              <w:t>Transactional email API, 300 emails/day free</w:t>
+            </w:r>
+          </w:p>
+        </w:tc>
+      </w:tr>
     </w:tbl>
     <w:p>
       <w:pPr>
@@ -6463,9 +6550,54 @@
         <w:pBdr>
           <w:bottom w:val="single" w:sz="4" w:space="5" w:color="1B4F8A"/>
         </w:pBdr>
+        <w:rPr>
+          <w:rtl/>
+        </w:rPr>
       </w:pPr>
       <w:bookmarkStart w:id="13" w:name="_Toc230188889"/>
-      <w:r>
+    </w:p>
+    <w:p>
+      <w:pPr>
+        <w:pStyle w:val="1"/>
+        <w:pBdr>
+          <w:bottom w:val="single" w:sz="4" w:space="5" w:color="1B4F8A"/>
+        </w:pBdr>
+        <w:rPr>
+          <w:rtl/>
+        </w:rPr>
+      </w:pPr>
+    </w:p>
+    <w:p>
+      <w:pPr>
+        <w:pStyle w:val="1"/>
+        <w:pBdr>
+          <w:bottom w:val="single" w:sz="4" w:space="5" w:color="1B4F8A"/>
+        </w:pBdr>
+        <w:rPr>
+          <w:rtl/>
+        </w:rPr>
+      </w:pPr>
+    </w:p>
+    <w:p>
+      <w:pPr>
+        <w:pStyle w:val="1"/>
+        <w:pBdr>
+          <w:bottom w:val="single" w:sz="4" w:space="5" w:color="1B4F8A"/>
+        </w:pBdr>
+        <w:rPr>
+          <w:rtl/>
+        </w:rPr>
+      </w:pPr>
+    </w:p>
+    <w:p>
+      <w:pPr>
+        <w:pStyle w:val="1"/>
+        <w:pBdr>
+          <w:bottom w:val="single" w:sz="4" w:space="5" w:color="1B4F8A"/>
+        </w:pBdr>
+      </w:pPr>
+      <w:r>
+        <w:lastRenderedPageBreak/>
         <w:t>8. Complexity Summary</w:t>
       </w:r>
       <w:bookmarkEnd w:id="13"/>
@@ -6960,7 +7092,6 @@
                 <w:sz w:val="20"/>
                 <w:szCs w:val="20"/>
               </w:rPr>
-              <w:lastRenderedPageBreak/>
               <w:t>Agentic AI</w:t>
             </w:r>
           </w:p>

</xml_diff>

<commit_message>
docs: update alert checker description with time window options
</commit_message>
<xml_diff>
--- a/WaveForecast_Architecture.docx
+++ b/WaveForecast_Architecture.docx
@@ -1434,7 +1434,7 @@
           <w:noProof/>
         </w:rPr>
         <w:drawing>
-          <wp:inline distT="0" distB="0" distL="0" distR="0" wp14:anchorId="14DBDCED" wp14:editId="44FCA383">
+          <wp:inline distT="0" distB="0" distL="0" distR="0" wp14:anchorId="41E69197" wp14:editId="0BA29BA3">
             <wp:extent cx="5791200" cy="4343400"/>
             <wp:effectExtent l="0" t="0" r="0" b="0"/>
             <wp:docPr id="313631713" name="תמונה 1"/>
@@ -2761,7 +2761,7 @@
         <w:t>-</w:t>
       </w:r>
       <w:r>
-        <w:t xml:space="preserve">runs every 30 minutes between 05:00–20:00, checks all active alerts, and sends an email via Brevo API when a spot's score meets the user's threshold. Each alert is sent at most once per day. (2) Cache Cleanup </w:t>
+        <w:t xml:space="preserve">runs every 30 minutes between 05:00–20:00, checks all active alerts within their configured time window (Dawn patrol 5-9am, Morning 9am-1pm, Noon 1-4pm, Sunset 4-7pm, or Any time), and sends an email via Brevo API when a spot's score meets the user's threshold. Each alert is sent at most once per day. (2) Cache Cleanup </w:t>
       </w:r>
       <w:r>
         <w:t>-</w:t>
@@ -2792,7 +2792,6 @@
       <w:pPr>
         <w:bidi w:val="0"/>
         <w:rPr>
-          <w:rFonts w:hint="cs"/>
           <w:rtl/>
         </w:rPr>
       </w:pPr>
@@ -6448,14 +6447,29 @@
       <w:tr>
         <w:tc>
           <w:tcPr>
-            <w:tcBorders>
-              <w:top w:val="single" w:sz="4" w:space="0" w:color="auto"/>
-              <w:left w:val="single" w:sz="4" w:space="0" w:color="auto"/>
-              <w:bottom w:val="single" w:sz="4" w:space="0" w:color="auto"/>
-              <w:right w:val="single" w:sz="4" w:space="0" w:color="auto"/>
-            </w:tcBorders>
-          </w:tcPr>
-          <w:p>
+            <w:tcW w:w="1800" w:type="dxa"/>
+            <w:tcBorders>
+              <w:top w:val="single" w:sz="1" w:space="0" w:color="CCCCCC"/>
+              <w:left w:val="single" w:sz="1" w:space="0" w:color="CCCCCC"/>
+              <w:bottom w:val="single" w:sz="1" w:space="0" w:color="CCCCCC"/>
+              <w:right w:val="single" w:sz="1" w:space="0" w:color="CCCCCC"/>
+            </w:tcBorders>
+            <w:shd w:val="clear" w:color="auto" w:fill="FFFFFF"/>
+            <w:tcMar>
+              <w:top w:w="72" w:type="dxa"/>
+              <w:left w:w="130" w:type="dxa"/>
+              <w:bottom w:w="72" w:type="dxa"/>
+              <w:right w:w="130" w:type="dxa"/>
+            </w:tcMar>
+          </w:tcPr>
+          <w:p>
+            <w:pPr>
+              <w:bidi w:val="0"/>
+              <w:rPr>
+                <w:sz w:val="20"/>
+                <w:szCs w:val="20"/>
+              </w:rPr>
+            </w:pPr>
             <w:r>
               <w:t>Brevo</w:t>
             </w:r>
@@ -6463,14 +6477,29 @@
         </w:tc>
         <w:tc>
           <w:tcPr>
-            <w:tcBorders>
-              <w:top w:val="single" w:sz="4" w:space="0" w:color="auto"/>
-              <w:left w:val="single" w:sz="4" w:space="0" w:color="auto"/>
-              <w:bottom w:val="single" w:sz="4" w:space="0" w:color="auto"/>
-              <w:right w:val="single" w:sz="4" w:space="0" w:color="auto"/>
-            </w:tcBorders>
-          </w:tcPr>
-          <w:p>
+            <w:tcW w:w="2000" w:type="dxa"/>
+            <w:tcBorders>
+              <w:top w:val="single" w:sz="1" w:space="0" w:color="CCCCCC"/>
+              <w:left w:val="single" w:sz="1" w:space="0" w:color="CCCCCC"/>
+              <w:bottom w:val="single" w:sz="1" w:space="0" w:color="CCCCCC"/>
+              <w:right w:val="single" w:sz="1" w:space="0" w:color="CCCCCC"/>
+            </w:tcBorders>
+            <w:shd w:val="clear" w:color="auto" w:fill="FFFFFF"/>
+            <w:tcMar>
+              <w:top w:w="72" w:type="dxa"/>
+              <w:left w:w="130" w:type="dxa"/>
+              <w:bottom w:w="72" w:type="dxa"/>
+              <w:right w:w="130" w:type="dxa"/>
+            </w:tcMar>
+          </w:tcPr>
+          <w:p>
+            <w:pPr>
+              <w:bidi w:val="0"/>
+              <w:rPr>
+                <w:sz w:val="20"/>
+                <w:szCs w:val="20"/>
+              </w:rPr>
+            </w:pPr>
             <w:r>
               <w:t>Email alerts</w:t>
             </w:r>
@@ -6478,14 +6507,29 @@
         </w:tc>
         <w:tc>
           <w:tcPr>
-            <w:tcBorders>
-              <w:top w:val="single" w:sz="4" w:space="0" w:color="auto"/>
-              <w:left w:val="single" w:sz="4" w:space="0" w:color="auto"/>
-              <w:bottom w:val="single" w:sz="4" w:space="0" w:color="auto"/>
-              <w:right w:val="single" w:sz="4" w:space="0" w:color="auto"/>
-            </w:tcBorders>
-          </w:tcPr>
-          <w:p>
+            <w:tcW w:w="5560" w:type="dxa"/>
+            <w:tcBorders>
+              <w:top w:val="single" w:sz="1" w:space="0" w:color="CCCCCC"/>
+              <w:left w:val="single" w:sz="1" w:space="0" w:color="CCCCCC"/>
+              <w:bottom w:val="single" w:sz="1" w:space="0" w:color="CCCCCC"/>
+              <w:right w:val="single" w:sz="1" w:space="0" w:color="CCCCCC"/>
+            </w:tcBorders>
+            <w:shd w:val="clear" w:color="auto" w:fill="FFFFFF"/>
+            <w:tcMar>
+              <w:top w:w="72" w:type="dxa"/>
+              <w:left w:w="130" w:type="dxa"/>
+              <w:bottom w:w="72" w:type="dxa"/>
+              <w:right w:w="130" w:type="dxa"/>
+            </w:tcMar>
+          </w:tcPr>
+          <w:p>
+            <w:pPr>
+              <w:bidi w:val="0"/>
+              <w:rPr>
+                <w:sz w:val="20"/>
+                <w:szCs w:val="20"/>
+              </w:rPr>
+            </w:pPr>
             <w:r>
               <w:t>Transactional email API, 300 emails/day free</w:t>
             </w:r>

</xml_diff>

<commit_message>
docs: add known limitation about OpenWeatherMap rate limit
</commit_message>
<xml_diff>
--- a/WaveForecast_Architecture.docx
+++ b/WaveForecast_Architecture.docx
@@ -3189,6 +3189,20 @@
         </w:tc>
       </w:tr>
     </w:tbl>
+    <w:p>
+      <w:pPr>
+        <w:bidi w:val="0"/>
+      </w:pPr>
+      <w:r>
+        <w:rPr>
+          <w:b/>
+        </w:rPr>
+        <w:t xml:space="preserve">Known Limitation: </w:t>
+      </w:r>
+      <w:r>
+        <w:t xml:space="preserve">OpenWeatherMap's free tier is capped at 60 requests/minute. When many spots are loaded simultaneously (e.g., on the homepage), some requests may exceed this limit and return without wind speed or temperature data. This resolves automatically once the 3-hour PostgreSQL cache is populated - subsequent requests are served from cache with no API calls.</w:t>
+      </w:r>
+    </w:p>
     <w:p>
       <w:pPr>
         <w:pStyle w:val="1"/>

</xml_diff>